<commit_message>
Add Merge Members Only action and update docs
New Copy Roles -> Merge Members Only custom action (Scripts/TE2_MergeMembers.cs,
wired into MacroActions.json) that merges role members into matching target roles
by name, preserving the target's existing members, RLS DAX, and ModelPermission.
Update README to document the 5th action across Features, Usage, Safety, audit
log, file structure, and the files table.
</commit_message>
<xml_diff>
--- a/docs/PBI_RoleCopy_HowTo.docx
+++ b/docs/PBI_RoleCopy_HowTo.docx
@@ -434,15 +434,16 @@
       </w:pPr>
       <w:r>
         <w:rPr>
+          <w:rFonts w:ascii="Arial" w:hAnsi="Arial"/>
           <w:color w:val="1A1A2E"/>
+          <w:sz w:val="21"/>
         </w:rPr>
-        <w:t>Macro</w:t>
+        <w:t>Macro Actions add right-click menu items to Tabular Editor 2. Once installed, you can export and import roles, copy members between models, and preview changes — all via right-click. No script editor, no copy/paste.</w:t>
       </w:r>
       <w:r>
         <w:rPr>
           <w:color w:val="1A1A2E"/>
         </w:rPr>
-        <w:t xml:space="preserve"> Actions add right-click menu items to Tabular Editor 2. Once installed, you copy roles between Power BI models in two clicks — no script editor, no copy/paste.</w:t>
       </w:r>
     </w:p>
     <w:p>
@@ -630,7 +631,7 @@
                 <w:sz w:val="18"/>
                 <w:szCs w:val="18"/>
               </w:rPr>
-              <w:t xml:space="preserve">4 </w:t>
+              <w:t>5 Macro Actions</w:t>
             </w:r>
             <w:r>
               <w:rPr>
@@ -640,7 +641,6 @@
                 <w:sz w:val="18"/>
                 <w:szCs w:val="18"/>
               </w:rPr>
-              <w:t>Macro</w:t>
             </w:r>
             <w:r>
               <w:rPr>
@@ -650,7 +650,6 @@
                 <w:sz w:val="18"/>
                 <w:szCs w:val="18"/>
               </w:rPr>
-              <w:t xml:space="preserve"> Actions</w:t>
             </w:r>
           </w:p>
         </w:tc>
@@ -674,11 +673,12 @@
           <w:p>
             <w:r>
               <w:rPr>
+                <w:rFonts w:ascii="Arial" w:hAnsi="Arial"/>
                 <w:color w:val="333333"/>
-                <w:sz w:val="18"/>
-                <w:szCs w:val="18"/>
-              </w:rPr>
-              <w:t xml:space="preserve">Export All / Export Select / Import Standard / Import </w:t>
+                <w:sz w:val="20"/>
+                <w:szCs w:val="18"/>
+              </w:rPr>
+              <w:t>Export All / Export Select / Import Standard / Import Select+Diff / Merge Members Only</w:t>
             </w:r>
             <w:proofErr w:type="spellStart"/>
             <w:r>
@@ -687,7 +687,6 @@
                 <w:sz w:val="18"/>
                 <w:szCs w:val="18"/>
               </w:rPr>
-              <w:t>Select+Diff</w:t>
             </w:r>
             <w:proofErr w:type="spellEnd"/>
           </w:p>
@@ -952,11 +951,12 @@
           <w:p>
             <w:r>
               <w:rPr>
+                <w:rFonts w:ascii="Arial" w:hAnsi="Arial"/>
                 <w:color w:val="333333"/>
-                <w:sz w:val="18"/>
-                <w:szCs w:val="18"/>
-              </w:rPr>
-              <w:t>File picker, confirmation dialog, same-model check, audit log</w:t>
+                <w:sz w:val="20"/>
+                <w:szCs w:val="18"/>
+              </w:rPr>
+              <w:t>File picker, confirmation dialog, same-model check, diff view, dry run mode, member merge (not replace), audit log, missing-roles warning list</w:t>
             </w:r>
           </w:p>
         </w:tc>
@@ -7126,7 +7126,7 @@
           <w:sz w:val="19"/>
           <w:szCs w:val="19"/>
         </w:rPr>
-        <w:t xml:space="preserve">It should contain: 📤 Export to </w:t>
+        <w:t>It should contain 5 actions: 📤 Export to file · 📤 Export — Select roles · 📥 Import from file · 📥 Import — Select + Diff · 👥 Merge Members Only</w:t>
       </w:r>
       <w:proofErr w:type="gramStart"/>
       <w:r>
@@ -7135,7 +7135,6 @@
           <w:sz w:val="19"/>
           <w:szCs w:val="19"/>
         </w:rPr>
-        <w:t>file  and</w:t>
       </w:r>
       <w:proofErr w:type="gramEnd"/>
       <w:r>
@@ -7144,7 +7143,6 @@
           <w:sz w:val="19"/>
           <w:szCs w:val="19"/>
         </w:rPr>
-        <w:t xml:space="preserve">  📥 Import from file</w:t>
       </w:r>
     </w:p>
     <w:p>
@@ -16904,6 +16902,377 @@
     <w:p>
       <w:pPr>
         <w:pStyle w:val="Heading1"/>
+      </w:pPr>
+      <w:r>
+        <w:t>Part 5 — Merge Members Only</w:t>
+      </w:r>
+    </w:p>
+    <w:p>
+      <w:r>
+        <w:rPr>
+          <w:rFonts w:ascii="Arial" w:hAnsi="Arial"/>
+          <w:sz w:val="21"/>
+        </w:rPr>
+        <w:t>Use this when roles already exist in the target model and you only need to copy the members across — without touching the RLS DAX filters that are already set up correctly in the target.</w:t>
+      </w:r>
+    </w:p>
+    <w:p>
+      <w:r>
+        <w:rPr>
+          <w:rFonts w:ascii="Arial" w:hAnsi="Arial"/>
+          <w:b/>
+          <w:color w:val="1B5E20"/>
+          <w:sz w:val="21"/>
+        </w:rPr>
+        <w:t>Members are MERGED, not replaced: the target's existing members are kept, and only members from the source that aren't already there get added. Roles are matched by name.</w:t>
+      </w:r>
+    </w:p>
+    <w:p>
+      <w:pPr>
+        <w:pStyle w:val="Heading2"/>
+      </w:pPr>
+      <w:r>
+        <w:t>When to use this</w:t>
+      </w:r>
+    </w:p>
+    <w:p>
+      <w:pPr>
+        <w:pStyle w:val="ListParagraph"/>
+      </w:pPr>
+      <w:r>
+        <w:t>• Roles already created in the target model, members need assigning</w:t>
+      </w:r>
+    </w:p>
+    <w:p>
+      <w:pPr>
+        <w:pStyle w:val="ListParagraph"/>
+      </w:pPr>
+      <w:r>
+        <w:t>• You want to copy member assignments from one model to another by matching role name</w:t>
+      </w:r>
+    </w:p>
+    <w:p>
+      <w:pPr>
+        <w:pStyle w:val="ListParagraph"/>
+      </w:pPr>
+      <w:r>
+        <w:t>• You do NOT want to change the target's RLS DAX filter expressions</w:t>
+      </w:r>
+    </w:p>
+    <w:p>
+      <w:pPr>
+        <w:pStyle w:val="Heading2"/>
+      </w:pPr>
+      <w:r>
+        <w:t>Workflow</w:t>
+      </w:r>
+    </w:p>
+    <w:p>
+      <w:pPr>
+        <w:pStyle w:val="ListParagraph"/>
+      </w:pPr>
+      <w:r>
+        <w:rPr>
+          <w:rFonts w:ascii="Arial" w:hAnsi="Arial"/>
+          <w:b/>
+          <w:color w:val="F36F21"/>
+          <w:sz w:val="20"/>
+        </w:rPr>
+        <w:t xml:space="preserve">1.  </w:t>
+      </w:r>
+      <w:r>
+        <w:rPr>
+          <w:rFonts w:ascii="Arial" w:hAnsi="Arial"/>
+          <w:b/>
+          <w:sz w:val="20"/>
+        </w:rPr>
+        <w:t xml:space="preserve">Export from source — </w:t>
+      </w:r>
+      <w:r>
+        <w:rPr>
+          <w:rFonts w:ascii="Arial" w:hAnsi="Arial"/>
+          <w:color w:val="555555"/>
+          <w:sz w:val="20"/>
+        </w:rPr>
+        <w:t>Connect TE2 to source model → right-click → Copy Roles → 📤 Export to file. This file contains roles, members and RLS DAX.</w:t>
+      </w:r>
+    </w:p>
+    <w:p>
+      <w:pPr>
+        <w:pStyle w:val="ListParagraph"/>
+      </w:pPr>
+      <w:r>
+        <w:rPr>
+          <w:rFonts w:ascii="Arial" w:hAnsi="Arial"/>
+          <w:b/>
+          <w:color w:val="F36F21"/>
+          <w:sz w:val="20"/>
+        </w:rPr>
+        <w:t xml:space="preserve">2.  </w:t>
+      </w:r>
+      <w:r>
+        <w:rPr>
+          <w:rFonts w:ascii="Arial" w:hAnsi="Arial"/>
+          <w:b/>
+          <w:sz w:val="20"/>
+        </w:rPr>
+        <w:t xml:space="preserve">Connect to target — </w:t>
+      </w:r>
+      <w:r>
+        <w:rPr>
+          <w:rFonts w:ascii="Arial" w:hAnsi="Arial"/>
+          <w:color w:val="555555"/>
+          <w:sz w:val="20"/>
+        </w:rPr>
+        <w:t>File → Open → From DB → connect to the target model (where roles already exist).</w:t>
+      </w:r>
+    </w:p>
+    <w:p>
+      <w:pPr>
+        <w:pStyle w:val="ListParagraph"/>
+      </w:pPr>
+      <w:r>
+        <w:rPr>
+          <w:rFonts w:ascii="Arial" w:hAnsi="Arial"/>
+          <w:b/>
+          <w:color w:val="F36F21"/>
+          <w:sz w:val="20"/>
+        </w:rPr>
+        <w:t xml:space="preserve">3.  </w:t>
+      </w:r>
+      <w:r>
+        <w:rPr>
+          <w:rFonts w:ascii="Arial" w:hAnsi="Arial"/>
+          <w:b/>
+          <w:sz w:val="20"/>
+        </w:rPr>
+        <w:t xml:space="preserve">Run Merge Members — </w:t>
+      </w:r>
+      <w:r>
+        <w:rPr>
+          <w:rFonts w:ascii="Arial" w:hAnsi="Arial"/>
+          <w:color w:val="555555"/>
+          <w:sz w:val="20"/>
+        </w:rPr>
+        <w:t>Right-click model → Copy Roles → 👥 Merge Members Only.</w:t>
+      </w:r>
+    </w:p>
+    <w:p>
+      <w:pPr>
+        <w:pStyle w:val="ListParagraph"/>
+      </w:pPr>
+      <w:r>
+        <w:rPr>
+          <w:rFonts w:ascii="Arial" w:hAnsi="Arial"/>
+          <w:b/>
+          <w:color w:val="F36F21"/>
+          <w:sz w:val="20"/>
+        </w:rPr>
+        <w:t xml:space="preserve">4.  </w:t>
+      </w:r>
+      <w:r>
+        <w:rPr>
+          <w:rFonts w:ascii="Arial" w:hAnsi="Arial"/>
+          <w:b/>
+          <w:sz w:val="20"/>
+        </w:rPr>
+        <w:t xml:space="preserve">Pick the export file — </w:t>
+      </w:r>
+      <w:r>
+        <w:rPr>
+          <w:rFonts w:ascii="Arial" w:hAnsi="Arial"/>
+          <w:color w:val="555555"/>
+          <w:sz w:val="20"/>
+        </w:rPr>
+        <w:t>File picker opens at C:\temp\PBIRoleCopy\ — pick the source export file.</w:t>
+      </w:r>
+    </w:p>
+    <w:p>
+      <w:pPr>
+        <w:pStyle w:val="ListParagraph"/>
+      </w:pPr>
+      <w:r>
+        <w:rPr>
+          <w:rFonts w:ascii="Arial" w:hAnsi="Arial"/>
+          <w:b/>
+          <w:color w:val="F36F21"/>
+          <w:sz w:val="20"/>
+        </w:rPr>
+        <w:t xml:space="preserve">5.  </w:t>
+      </w:r>
+      <w:r>
+        <w:rPr>
+          <w:rFonts w:ascii="Arial" w:hAnsi="Arial"/>
+          <w:b/>
+          <w:sz w:val="20"/>
+        </w:rPr>
+        <w:t xml:space="preserve">Review the list — </w:t>
+      </w:r>
+      <w:r>
+        <w:rPr>
+          <w:rFonts w:ascii="Arial" w:hAnsi="Arial"/>
+          <w:color w:val="555555"/>
+          <w:sz w:val="20"/>
+        </w:rPr>
+        <w:t>Each source role is classified against the target (see statuses below).</w:t>
+      </w:r>
+    </w:p>
+    <w:p>
+      <w:pPr>
+        <w:pStyle w:val="ListParagraph"/>
+      </w:pPr>
+      <w:r>
+        <w:rPr>
+          <w:rFonts w:ascii="Arial" w:hAnsi="Arial"/>
+          <w:b/>
+          <w:color w:val="F36F21"/>
+          <w:sz w:val="20"/>
+        </w:rPr>
+        <w:t xml:space="preserve">6.  </w:t>
+      </w:r>
+      <w:r>
+        <w:rPr>
+          <w:rFonts w:ascii="Arial" w:hAnsi="Arial"/>
+          <w:b/>
+          <w:sz w:val="20"/>
+        </w:rPr>
+        <w:t xml:space="preserve">Select roles — </w:t>
+      </w:r>
+      <w:r>
+        <w:rPr>
+          <w:rFonts w:ascii="Arial" w:hAnsi="Arial"/>
+          <w:color w:val="555555"/>
+          <w:sz w:val="20"/>
+        </w:rPr>
+        <w:t>Pre-ticked: roles that have new members to add. Click ● New members to re-select just those. Use the filter box to search.</w:t>
+      </w:r>
+    </w:p>
+    <w:p>
+      <w:pPr>
+        <w:pStyle w:val="ListParagraph"/>
+      </w:pPr>
+      <w:r>
+        <w:rPr>
+          <w:rFonts w:ascii="Arial" w:hAnsi="Arial"/>
+          <w:b/>
+          <w:color w:val="F36F21"/>
+          <w:sz w:val="20"/>
+        </w:rPr>
+        <w:t xml:space="preserve">7.  </w:t>
+      </w:r>
+      <w:r>
+        <w:rPr>
+          <w:rFonts w:ascii="Arial" w:hAnsi="Arial"/>
+          <w:b/>
+          <w:sz w:val="20"/>
+        </w:rPr>
+        <w:t xml:space="preserve">Click Merge Members — </w:t>
+      </w:r>
+      <w:r>
+        <w:rPr>
+          <w:rFonts w:ascii="Arial" w:hAnsi="Arial"/>
+          <w:color w:val="555555"/>
+          <w:sz w:val="20"/>
+        </w:rPr>
+        <w:t>Confirmation dialog shows how many new members will be added → Yes to commit.</w:t>
+      </w:r>
+    </w:p>
+    <w:p>
+      <w:pPr>
+        <w:pStyle w:val="ListParagraph"/>
+      </w:pPr>
+      <w:r>
+        <w:rPr>
+          <w:rFonts w:ascii="Arial" w:hAnsi="Arial"/>
+          <w:b/>
+          <w:color w:val="F36F21"/>
+          <w:sz w:val="20"/>
+        </w:rPr>
+        <w:t xml:space="preserve">8.  </w:t>
+      </w:r>
+      <w:r>
+        <w:rPr>
+          <w:rFonts w:ascii="Arial" w:hAnsi="Arial"/>
+          <w:b/>
+          <w:sz w:val="20"/>
+        </w:rPr>
+        <w:t xml:space="preserve">Review summary — </w:t>
+      </w:r>
+      <w:r>
+        <w:rPr>
+          <w:rFonts w:ascii="Arial" w:hAnsi="Arial"/>
+          <w:color w:val="555555"/>
+          <w:sz w:val="20"/>
+        </w:rPr>
+        <w:t>Shows roles updated, new members added, and a warning list of any roles skipped (not found in target).</w:t>
+      </w:r>
+    </w:p>
+    <w:p>
+      <w:pPr>
+        <w:pStyle w:val="Heading2"/>
+      </w:pPr>
+      <w:r>
+        <w:t>Row statuses</w:t>
+      </w:r>
+    </w:p>
+    <w:p>
+      <w:pPr>
+        <w:pStyle w:val="ListParagraph"/>
+      </w:pPr>
+      <w:r>
+        <w:t>• [+ MERGE] (green) — role exists in target and the source file has members not yet in target. Pre-ticked. Members will be added.</w:t>
+      </w:r>
+    </w:p>
+    <w:p>
+      <w:pPr>
+        <w:pStyle w:val="ListParagraph"/>
+      </w:pPr>
+      <w:r>
+        <w:t>• [IN SYNC] (grey) — role exists in target and all source members are already present. Nothing to do — left un-ticked.</w:t>
+      </w:r>
+    </w:p>
+    <w:p>
+      <w:pPr>
+        <w:pStyle w:val="ListParagraph"/>
+      </w:pPr>
+      <w:r>
+        <w:t>• [MISSING] (red) — role from the source file does not exist in the target model. Locked, cannot be ticked. Listed in the warning summary and saved to a missing_roles text file.</w:t>
+      </w:r>
+    </w:p>
+    <w:p>
+      <w:r>
+        <w:rPr>
+          <w:rFonts w:ascii="Arial" w:hAnsi="Arial"/>
+          <w:sz w:val="21"/>
+        </w:rPr>
+      </w:r>
+    </w:p>
+    <w:p>
+      <w:r>
+        <w:rPr>
+          <w:rFonts w:ascii="Arial" w:hAnsi="Arial"/>
+          <w:sz w:val="21"/>
+        </w:rPr>
+      </w:r>
+      <w:r>
+        <w:rPr>
+          <w:rFonts w:ascii="Arial" w:hAnsi="Arial"/>
+          <w:sz w:val="20"/>
+        </w:rPr>
+        <w:t xml:space="preserve">💡  </w:t>
+      </w:r>
+      <w:r>
+        <w:rPr>
+          <w:rFonts w:ascii="Arial" w:hAnsi="Arial"/>
+          <w:color w:val="5D4037"/>
+          <w:sz w:val="20"/>
+        </w:rPr>
+        <w:t>What is preserved: the target's existing members are kept (merge, not replace), the target's RLS DAX filter expressions are untouched, and the target's ModelPermission level is unchanged. Only members get added.</w:t>
+      </w:r>
+    </w:p>
+    <w:p>
+      <w:pPr>
+        <w:pStyle w:val="Heading1"/>
         <w:pBdr>
           <w:bottom w:val="single" w:sz="8" w:space="6" w:color="F36F21"/>
         </w:pBdr>
@@ -18352,6 +18721,181 @@
     <w:p>
       <w:pPr>
         <w:pStyle w:val="Heading1"/>
+      </w:pPr>
+      <w:r>
+        <w:t>Appendix F — Merge Members Script Notes</w:t>
+      </w:r>
+    </w:p>
+    <w:p>
+      <w:r>
+        <w:rPr>
+          <w:rFonts w:ascii="Arial" w:hAnsi="Arial"/>
+          <w:sz w:val="21"/>
+        </w:rPr>
+        <w:t>Script for the 👥 Merge Members Only custom action. Requires #r "System.Drawing" at the top.</w:t>
+      </w:r>
+    </w:p>
+    <w:p>
+      <w:r>
+        <w:rPr>
+          <w:rFonts w:ascii="Arial" w:hAnsi="Arial"/>
+          <w:sz w:val="21"/>
+        </w:rPr>
+        <w:t>You don't normally need to paste this — use the right-click menu (Part 5). Provided for maintenance.</w:t>
+      </w:r>
+    </w:p>
+    <w:p>
+      <w:r>
+        <w:rPr>
+          <w:rFonts w:ascii="Consolas" w:hAnsi="Consolas"/>
+          <w:color w:val="1A237E"/>
+          <w:sz w:val="20"/>
+        </w:rPr>
+        <w:t>#r "System.Drawing"   // required — adds assembly reference in TE2</w:t>
+      </w:r>
+    </w:p>
+    <w:p>
+      <w:r>
+        <w:rPr>
+          <w:rFonts w:ascii="Consolas" w:hAnsi="Consolas"/>
+          <w:color w:val="1A237E"/>
+          <w:sz w:val="20"/>
+        </w:rPr>
+        <w:t>using System.Drawing; using System.Windows.Forms;</w:t>
+      </w:r>
+    </w:p>
+    <w:p>
+      <w:r>
+        <w:rPr>
+          <w:rFonts w:ascii="Consolas" w:hAnsi="Consolas"/>
+          <w:color w:val="1A237E"/>
+          <w:sz w:val="20"/>
+        </w:rPr>
+      </w:r>
+    </w:p>
+    <w:p>
+      <w:r>
+        <w:rPr>
+          <w:rFonts w:ascii="Consolas" w:hAnsi="Consolas"/>
+          <w:color w:val="1A237E"/>
+          <w:sz w:val="20"/>
+        </w:rPr>
+        <w:t>// 1. File picker → parse source export file</w:t>
+      </w:r>
+    </w:p>
+    <w:p>
+      <w:r>
+        <w:rPr>
+          <w:rFonts w:ascii="Consolas" w:hAnsi="Consolas"/>
+          <w:color w:val="1A237E"/>
+          <w:sz w:val="20"/>
+        </w:rPr>
+        <w:t>// 2. Snapshot target: each role → set of existing memberIds</w:t>
+      </w:r>
+    </w:p>
+    <w:p>
+      <w:r>
+        <w:rPr>
+          <w:rFonts w:ascii="Consolas" w:hAnsi="Consolas"/>
+          <w:color w:val="1A237E"/>
+          <w:sz w:val="20"/>
+        </w:rPr>
+        <w:t>// 3. Classify each source role:</w:t>
+      </w:r>
+    </w:p>
+    <w:p>
+      <w:r>
+        <w:rPr>
+          <w:rFonts w:ascii="Consolas" w:hAnsi="Consolas"/>
+          <w:color w:val="1A237E"/>
+          <w:sz w:val="20"/>
+        </w:rPr>
+        <w:t>//      [+ MERGE]  role in target, source has members not yet there</w:t>
+      </w:r>
+    </w:p>
+    <w:p>
+      <w:r>
+        <w:rPr>
+          <w:rFonts w:ascii="Consolas" w:hAnsi="Consolas"/>
+          <w:color w:val="1A237E"/>
+          <w:sz w:val="20"/>
+        </w:rPr>
+        <w:t>//      [IN SYNC]  role in target, all source members already present</w:t>
+      </w:r>
+    </w:p>
+    <w:p>
+      <w:r>
+        <w:rPr>
+          <w:rFonts w:ascii="Consolas" w:hAnsi="Consolas"/>
+          <w:color w:val="1A237E"/>
+          <w:sz w:val="20"/>
+        </w:rPr>
+        <w:t>//      [MISSING]  role not in target  → skipped + warning list</w:t>
+      </w:r>
+    </w:p>
+    <w:p>
+      <w:r>
+        <w:rPr>
+          <w:rFonts w:ascii="Consolas" w:hAnsi="Consolas"/>
+          <w:color w:val="1A237E"/>
+          <w:sz w:val="20"/>
+        </w:rPr>
+        <w:t>// 4. Owner-drawn CheckedListBox, MISSING rows locked</w:t>
+      </w:r>
+    </w:p>
+    <w:p>
+      <w:r>
+        <w:rPr>
+          <w:rFonts w:ascii="Consolas" w:hAnsi="Consolas"/>
+          <w:color w:val="1A237E"/>
+          <w:sz w:val="20"/>
+        </w:rPr>
+        <w:t>// 5. On merge, per selected role build createOrReplace with:</w:t>
+      </w:r>
+    </w:p>
+    <w:p>
+      <w:r>
+        <w:rPr>
+          <w:rFonts w:ascii="Consolas" w:hAnsi="Consolas"/>
+          <w:color w:val="1A237E"/>
+          <w:sz w:val="20"/>
+        </w:rPr>
+        <w:t>//      - target ModelPermission   (unchanged)</w:t>
+      </w:r>
+    </w:p>
+    <w:p>
+      <w:r>
+        <w:rPr>
+          <w:rFonts w:ascii="Consolas" w:hAnsi="Consolas"/>
+          <w:color w:val="1A237E"/>
+          <w:sz w:val="20"/>
+        </w:rPr>
+        <w:t>//      - target tablePermissions  (RLS DAX preserved)</w:t>
+      </w:r>
+    </w:p>
+    <w:p>
+      <w:r>
+        <w:rPr>
+          <w:rFonts w:ascii="Consolas" w:hAnsi="Consolas"/>
+          <w:color w:val="1A237E"/>
+          <w:sz w:val="20"/>
+        </w:rPr>
+        <w:t>//      - members = target existing + source new (dedup by memberId)</w:t>
+      </w:r>
+    </w:p>
+    <w:p>
+      <w:r>
+        <w:rPr>
+          <w:rFonts w:ascii="Consolas" w:hAnsi="Consolas"/>
+          <w:color w:val="1A237E"/>
+          <w:sz w:val="20"/>
+        </w:rPr>
+        <w:t>// 6. ExecuteCommand · audit.log · missing_roles_&lt;timestamp&gt;.txt</w:t>
+      </w:r>
+    </w:p>
+    <w:p>
+      <w:pPr>
+        <w:pStyle w:val="Heading1"/>
         <w:pBdr>
           <w:bottom w:val="single" w:sz="8" w:space="6" w:color="F36F21"/>
         </w:pBdr>
@@ -19173,6 +19717,37 @@
                 <w:szCs w:val="18"/>
               </w:rPr>
               <w:t>Re-run Import action → pick older file → confirm</w:t>
+            </w:r>
+          </w:p>
+        </w:tc>
+      </w:tr>
+      <w:tr>
+        <w:tc>
+          <w:tcPr>
+            <w:tcW w:type="dxa" w:w="3000"/>
+          </w:tcPr>
+          <w:p>
+            <w:r>
+              <w:rPr>
+                <w:rFonts w:ascii="Arial" w:hAnsi="Arial"/>
+                <w:b/>
+                <w:sz w:val="20"/>
+              </w:rPr>
+              <w:t>Merge members</w:t>
+            </w:r>
+          </w:p>
+        </w:tc>
+        <w:tc>
+          <w:tcPr>
+            <w:tcW w:type="dxa" w:w="6360"/>
+          </w:tcPr>
+          <w:p>
+            <w:r>
+              <w:rPr>
+                <w:rFonts w:ascii="Arial" w:hAnsi="Arial"/>
+                <w:sz w:val="20"/>
+              </w:rPr>
+              <w:t>Right-click → Copy Roles → 👥 Merge Members Only</w:t>
             </w:r>
           </w:p>
         </w:tc>

</xml_diff>